<commit_message>
refactor: yorumlar anonim puana cevrildi, 15 yas kapsamindan cikis, Sentry kaldirildi
- Yorum metni/ad/fotograf, sikayet ve engelleme kaldirildi; yalnizca anonim
  yildiz puani (web+mobil). Kullanicilar herkese acik icerik paylasmadigi icin
  uygulama 5651 ek 4 'sosyal ag saglayici' kapsami disinda -> yas beyani,
  15-17 kisitlari, ebeveyn sayfasi ve SGB dilekcesi kaldirildi
- Tarif onerilerinde gonderen adi artik yayinlanan tarife yazilmiyor (admin
  adi users/{uid}'den okur)
- Sentry tamamen kaldirildi (paket, init, ErrorBoundary); KVKK metinleri ve
  standart sozlesmeler (Sentry'siz 4 sozlesme) guncellendi
- firestore.rules: reviews icin siki surum hazir ama yorumda -- App Store
  incelemesindeki build 20 hala yorum yaziyor; 1.0.1 yayinlaninca etkinlesecek
- storage: review-photos yeni yukleme kapali
- Mevcut tek yorumun metni/adi silindi (scripts/strip-review-text.js)

Co-Authored-By: Claude Opus 5.5 <noreply@anthropic.com>
</commit_message>
<xml_diff>
--- a/legal/kvkk-yurt-disi-aktarim/SS1_Google-AdMob-AdSense.docx
+++ b/legal/kvkk-yurt-disi-aktarim/SS1_Google-AdMob-AdSense.docx
@@ -1310,7 +1310,7 @@
     </w:p>
     <w:p>
       <w:r>
-        <w:t>Kişiselleştirilmemiş reklam için Kanun md.5/2-(f) meşru menfaat; kişiselleştirilmiş reklam için ilgili kişinin açık rızası (md.5/1); 15-18 yaş arası kullanıcılar için yalnızca kişiselleştirilmemiş reklam. Yurt dışına aktarım bakımından Kanun md.9/4-(c) uyarınca bu standart sözleşme.</w:t>
+        <w:t>Kişiselleştirilmemiş reklam için Kanun md.5/2-(f) meşru menfaat; kişiselleştirilmiş reklam için ilgili kişinin açık rızası (md.5/1). Yurt dışına aktarım bakımından Kanun md.9/4-(c) uyarınca bu standart sözleşme.</w:t>
       </w:r>
     </w:p>
     <w:p>
@@ -1422,7 +1422,7 @@
         <w:pStyle w:val="ListBullet"/>
       </w:pPr>
       <w:r>
-        <w:t>Veri aktaran, açık rızası olmayan ve 15-18 yaş arası kullanıcılar için yalnızca kişiselleştirilmemiş reklam ister (AdSense requestNonPersonalizedAds, AdMob requestNonPersonalizedAdsOnly).</w:t>
+        <w:t>Veri aktaran, açık rızası olmayan kullanıcılar için yalnızca kişiselleştirilmemiş reklam ister (AdSense requestNonPersonalizedAds, AdMob requestNonPersonalizedAdsOnly).</w:t>
       </w:r>
     </w:p>
     <w:p>

</xml_diff>